<commit_message>
Add five-model price-band evaluations
- evaluated all five models across (test) June 2026 price quintiles
- updated the findings brief with model-level band insights

Key band findings:
Random Forest and Decision Tree perform best at $575k–$800k: 6.24% and 7.90% MdAPE.
XGBoost and LightGBM perform best at $800k–$1.1M: 9.88% and 10.34% MdAPE.
Linear Regression performs best at $1.1M–$1.67M, with 13.78% MdAPE.
The tree models collectively perform better from $575k–$1.1M.
Performance weakens at the low-price or open-ended luxury extremes.
</commit_message>
<xml_diff>
--- a/Week 8 Deliverable/Week8_Evaluation_Findings.docx
+++ b/Week 8 Deliverable/Week8_Evaluation_Findings.docx
@@ -1395,6 +1395,1386 @@
         <w:t>. Recheck both on future rolling monthly holdouts and by price band before a production choice.</w:t>
       </w:r>
     </w:p>
+    <w:p>
+      <w:r>
+        <w:br w:type="page"/>
+      </w:r>
+    </w:p>
+    <w:p>
+      <w:pPr>
+        <w:pStyle w:val="Heading1"/>
+        <w:keepNext/>
+      </w:pPr>
+      <w:r>
+        <w:t>Price-band performance</w:t>
+      </w:r>
+    </w:p>
+    <w:p>
+      <w:pPr>
+        <w:spacing w:before="0" w:after="120" w:line="259" w:lineRule="auto"/>
+      </w:pPr>
+      <w:r>
+        <w:rPr>
+          <w:rFonts w:ascii="Calibri" w:hAnsi="Calibri"/>
+          <w:b w:val="0"/>
+          <w:i w:val="0"/>
+          <w:color w:val="000000"/>
+          <w:sz w:val="21"/>
+        </w:rPr>
+        <w:t>June 2026 sales were split into five equal-frequency price bands (about 2,550-2,620 sales each). Better and weaker bands below are ranked by MdAPE, so the comparison focuses on typical relative error.</w:t>
+      </w:r>
+    </w:p>
+    <w:p>
+      <w:pPr>
+        <w:keepNext/>
+        <w:spacing w:before="80" w:after="80"/>
+      </w:pPr>
+      <w:r>
+        <w:rPr>
+          <w:rFonts w:ascii="Calibri" w:hAnsi="Calibri"/>
+          <w:b w:val="0"/>
+          <w:i/>
+          <w:color w:val="595959"/>
+          <w:sz w:val="18"/>
+        </w:rPr>
+        <w:t>Table 2. Best and weakest June 2026 price bands within each model.</w:t>
+      </w:r>
+    </w:p>
+    <w:tbl>
+      <w:tblPr>
+        <w:tblW w:type="dxa" w:w="9360"/>
+        <w:jc w:val="left"/>
+        <w:tblLayout w:type="fixed"/>
+        <w:tblLook w:firstColumn="1" w:firstRow="1" w:lastColumn="0" w:lastRow="0" w:noHBand="0" w:noVBand="1" w:val="04A0"/>
+        <w:tblInd w:type="dxa" w:w="120"/>
+      </w:tblPr>
+      <w:tblGrid>
+        <w:gridCol w:w="1800"/>
+        <w:gridCol w:w="3000"/>
+        <w:gridCol w:w="1100"/>
+        <w:gridCol w:w="2200"/>
+        <w:gridCol w:w="1260"/>
+      </w:tblGrid>
+      <w:tr>
+        <w:trPr>
+          <w:tblHeader w:val="true"/>
+        </w:trPr>
+        <w:tc>
+          <w:tcPr>
+            <w:tcW w:type="dxa" w:w="1800"/>
+            <w:shd w:fill="F2F4F7"/>
+            <w:tcBorders>
+              <w:top w:val="single" w:sz="4" w:space="0" w:color="B7C3D0"/>
+              <w:left w:val="single" w:sz="4" w:space="0" w:color="B7C3D0"/>
+              <w:bottom w:val="single" w:sz="4" w:space="0" w:color="B7C3D0"/>
+              <w:right w:val="single" w:sz="4" w:space="0" w:color="B7C3D0"/>
+              <w:insideH w:val="single" w:sz="4" w:space="0" w:color="B7C3D0"/>
+              <w:insideV w:val="single" w:sz="4" w:space="0" w:color="B7C3D0"/>
+            </w:tcBorders>
+            <w:vAlign w:val="center"/>
+            <w:tcMar>
+              <w:top w:w="80" w:type="dxa"/>
+              <w:bottom w:w="80" w:type="dxa"/>
+              <w:start w:w="120" w:type="dxa"/>
+              <w:end w:w="120" w:type="dxa"/>
+            </w:tcMar>
+          </w:tcPr>
+          <w:p>
+            <w:pPr>
+              <w:spacing w:before="0" w:after="0" w:line="240" w:lineRule="auto"/>
+              <w:jc w:val="left"/>
+            </w:pPr>
+            <w:r/>
+            <w:r>
+              <w:rPr>
+                <w:rFonts w:ascii="Calibri" w:hAnsi="Calibri"/>
+                <w:b/>
+                <w:i w:val="0"/>
+                <w:color w:val="1F4D78"/>
+                <w:sz w:val="17"/>
+              </w:rPr>
+              <w:t>Model</w:t>
+            </w:r>
+          </w:p>
+        </w:tc>
+        <w:tc>
+          <w:tcPr>
+            <w:tcW w:type="dxa" w:w="3000"/>
+            <w:shd w:fill="F2F4F7"/>
+            <w:tcBorders>
+              <w:top w:val="single" w:sz="4" w:space="0" w:color="B7C3D0"/>
+              <w:left w:val="single" w:sz="4" w:space="0" w:color="B7C3D0"/>
+              <w:bottom w:val="single" w:sz="4" w:space="0" w:color="B7C3D0"/>
+              <w:right w:val="single" w:sz="4" w:space="0" w:color="B7C3D0"/>
+              <w:insideH w:val="single" w:sz="4" w:space="0" w:color="B7C3D0"/>
+              <w:insideV w:val="single" w:sz="4" w:space="0" w:color="B7C3D0"/>
+            </w:tcBorders>
+            <w:vAlign w:val="center"/>
+            <w:tcMar>
+              <w:top w:w="80" w:type="dxa"/>
+              <w:bottom w:w="80" w:type="dxa"/>
+              <w:start w:w="120" w:type="dxa"/>
+              <w:end w:w="120" w:type="dxa"/>
+            </w:tcMar>
+          </w:tcPr>
+          <w:p>
+            <w:pPr>
+              <w:spacing w:before="0" w:after="0" w:line="240" w:lineRule="auto"/>
+              <w:jc w:val="left"/>
+            </w:pPr>
+            <w:r/>
+            <w:r>
+              <w:rPr>
+                <w:rFonts w:ascii="Calibri" w:hAnsi="Calibri"/>
+                <w:b/>
+                <w:i w:val="0"/>
+                <w:color w:val="1F4D78"/>
+                <w:sz w:val="17"/>
+              </w:rPr>
+              <w:t>Better bands</w:t>
+            </w:r>
+          </w:p>
+        </w:tc>
+        <w:tc>
+          <w:tcPr>
+            <w:tcW w:type="dxa" w:w="1100"/>
+            <w:shd w:fill="F2F4F7"/>
+            <w:tcBorders>
+              <w:top w:val="single" w:sz="4" w:space="0" w:color="B7C3D0"/>
+              <w:left w:val="single" w:sz="4" w:space="0" w:color="B7C3D0"/>
+              <w:bottom w:val="single" w:sz="4" w:space="0" w:color="B7C3D0"/>
+              <w:right w:val="single" w:sz="4" w:space="0" w:color="B7C3D0"/>
+              <w:insideH w:val="single" w:sz="4" w:space="0" w:color="B7C3D0"/>
+              <w:insideV w:val="single" w:sz="4" w:space="0" w:color="B7C3D0"/>
+            </w:tcBorders>
+            <w:vAlign w:val="center"/>
+            <w:tcMar>
+              <w:top w:w="80" w:type="dxa"/>
+              <w:bottom w:w="80" w:type="dxa"/>
+              <w:start w:w="120" w:type="dxa"/>
+              <w:end w:w="120" w:type="dxa"/>
+            </w:tcMar>
+          </w:tcPr>
+          <w:p>
+            <w:pPr>
+              <w:spacing w:before="0" w:after="0" w:line="240" w:lineRule="auto"/>
+              <w:jc w:val="center"/>
+            </w:pPr>
+            <w:r/>
+            <w:r>
+              <w:rPr>
+                <w:rFonts w:ascii="Calibri" w:hAnsi="Calibri"/>
+                <w:b/>
+                <w:i w:val="0"/>
+                <w:color w:val="1F4D78"/>
+                <w:sz w:val="17"/>
+              </w:rPr>
+              <w:t>Best MdAPE</w:t>
+            </w:r>
+          </w:p>
+        </w:tc>
+        <w:tc>
+          <w:tcPr>
+            <w:tcW w:type="dxa" w:w="2200"/>
+            <w:shd w:fill="F2F4F7"/>
+            <w:tcBorders>
+              <w:top w:val="single" w:sz="4" w:space="0" w:color="B7C3D0"/>
+              <w:left w:val="single" w:sz="4" w:space="0" w:color="B7C3D0"/>
+              <w:bottom w:val="single" w:sz="4" w:space="0" w:color="B7C3D0"/>
+              <w:right w:val="single" w:sz="4" w:space="0" w:color="B7C3D0"/>
+              <w:insideH w:val="single" w:sz="4" w:space="0" w:color="B7C3D0"/>
+              <w:insideV w:val="single" w:sz="4" w:space="0" w:color="B7C3D0"/>
+            </w:tcBorders>
+            <w:vAlign w:val="center"/>
+            <w:tcMar>
+              <w:top w:w="80" w:type="dxa"/>
+              <w:bottom w:w="80" w:type="dxa"/>
+              <w:start w:w="120" w:type="dxa"/>
+              <w:end w:w="120" w:type="dxa"/>
+            </w:tcMar>
+          </w:tcPr>
+          <w:p>
+            <w:pPr>
+              <w:spacing w:before="0" w:after="0" w:line="240" w:lineRule="auto"/>
+              <w:jc w:val="left"/>
+            </w:pPr>
+            <w:r/>
+            <w:r>
+              <w:rPr>
+                <w:rFonts w:ascii="Calibri" w:hAnsi="Calibri"/>
+                <w:b/>
+                <w:i w:val="0"/>
+                <w:color w:val="1F4D78"/>
+                <w:sz w:val="17"/>
+              </w:rPr>
+              <w:t>Weakest band</w:t>
+            </w:r>
+          </w:p>
+        </w:tc>
+        <w:tc>
+          <w:tcPr>
+            <w:tcW w:type="dxa" w:w="1260"/>
+            <w:shd w:fill="F2F4F7"/>
+            <w:tcBorders>
+              <w:top w:val="single" w:sz="4" w:space="0" w:color="B7C3D0"/>
+              <w:left w:val="single" w:sz="4" w:space="0" w:color="B7C3D0"/>
+              <w:bottom w:val="single" w:sz="4" w:space="0" w:color="B7C3D0"/>
+              <w:right w:val="single" w:sz="4" w:space="0" w:color="B7C3D0"/>
+              <w:insideH w:val="single" w:sz="4" w:space="0" w:color="B7C3D0"/>
+              <w:insideV w:val="single" w:sz="4" w:space="0" w:color="B7C3D0"/>
+            </w:tcBorders>
+            <w:vAlign w:val="center"/>
+            <w:tcMar>
+              <w:top w:w="80" w:type="dxa"/>
+              <w:bottom w:w="80" w:type="dxa"/>
+              <w:start w:w="120" w:type="dxa"/>
+              <w:end w:w="120" w:type="dxa"/>
+            </w:tcMar>
+          </w:tcPr>
+          <w:p>
+            <w:pPr>
+              <w:spacing w:before="0" w:after="0" w:line="240" w:lineRule="auto"/>
+              <w:jc w:val="center"/>
+            </w:pPr>
+            <w:r/>
+            <w:r>
+              <w:rPr>
+                <w:rFonts w:ascii="Calibri" w:hAnsi="Calibri"/>
+                <w:b/>
+                <w:i w:val="0"/>
+                <w:color w:val="1F4D78"/>
+                <w:sz w:val="17"/>
+              </w:rPr>
+              <w:t>Weak MdAPE</w:t>
+            </w:r>
+          </w:p>
+        </w:tc>
+      </w:tr>
+      <w:tr>
+        <w:trPr/>
+        <w:tc>
+          <w:tcPr>
+            <w:tcW w:type="dxa" w:w="1800"/>
+            <w:vAlign w:val="center"/>
+            <w:tcBorders>
+              <w:top w:val="single" w:sz="4" w:space="0" w:color="B7C3D0"/>
+              <w:left w:val="single" w:sz="4" w:space="0" w:color="B7C3D0"/>
+              <w:bottom w:val="single" w:sz="4" w:space="0" w:color="B7C3D0"/>
+              <w:right w:val="single" w:sz="4" w:space="0" w:color="B7C3D0"/>
+              <w:insideH w:val="single" w:sz="4" w:space="0" w:color="B7C3D0"/>
+              <w:insideV w:val="single" w:sz="4" w:space="0" w:color="B7C3D0"/>
+            </w:tcBorders>
+            <w:tcMar>
+              <w:top w:w="80" w:type="dxa"/>
+              <w:bottom w:w="80" w:type="dxa"/>
+              <w:start w:w="120" w:type="dxa"/>
+              <w:end w:w="120" w:type="dxa"/>
+            </w:tcMar>
+          </w:tcPr>
+          <w:p>
+            <w:pPr>
+              <w:spacing w:before="0" w:after="0" w:line="240" w:lineRule="auto"/>
+              <w:jc w:val="left"/>
+            </w:pPr>
+            <w:r/>
+            <w:r>
+              <w:rPr>
+                <w:rFonts w:ascii="Calibri" w:hAnsi="Calibri"/>
+                <w:b w:val="0"/>
+                <w:i w:val="0"/>
+                <w:color w:val="000000"/>
+                <w:sz w:val="17"/>
+              </w:rPr>
+              <w:t>XGBoost</w:t>
+            </w:r>
+          </w:p>
+        </w:tc>
+        <w:tc>
+          <w:tcPr>
+            <w:tcW w:type="dxa" w:w="3000"/>
+            <w:vAlign w:val="center"/>
+            <w:tcBorders>
+              <w:top w:val="single" w:sz="4" w:space="0" w:color="B7C3D0"/>
+              <w:left w:val="single" w:sz="4" w:space="0" w:color="B7C3D0"/>
+              <w:bottom w:val="single" w:sz="4" w:space="0" w:color="B7C3D0"/>
+              <w:right w:val="single" w:sz="4" w:space="0" w:color="B7C3D0"/>
+              <w:insideH w:val="single" w:sz="4" w:space="0" w:color="B7C3D0"/>
+              <w:insideV w:val="single" w:sz="4" w:space="0" w:color="B7C3D0"/>
+            </w:tcBorders>
+            <w:shd w:fill="DDEBF7"/>
+            <w:tcMar>
+              <w:top w:w="80" w:type="dxa"/>
+              <w:bottom w:w="80" w:type="dxa"/>
+              <w:start w:w="120" w:type="dxa"/>
+              <w:end w:w="120" w:type="dxa"/>
+            </w:tcMar>
+          </w:tcPr>
+          <w:p>
+            <w:pPr>
+              <w:spacing w:before="0" w:after="0" w:line="240" w:lineRule="auto"/>
+              <w:jc w:val="left"/>
+            </w:pPr>
+            <w:r/>
+            <w:r>
+              <w:rPr>
+                <w:rFonts w:ascii="Calibri" w:hAnsi="Calibri"/>
+                <w:b w:val="0"/>
+                <w:i w:val="0"/>
+                <w:color w:val="000000"/>
+                <w:sz w:val="17"/>
+              </w:rPr>
+              <w:t>$800k-$1.1M; $575k-$800k</w:t>
+            </w:r>
+          </w:p>
+        </w:tc>
+        <w:tc>
+          <w:tcPr>
+            <w:tcW w:type="dxa" w:w="1100"/>
+            <w:vAlign w:val="center"/>
+            <w:tcBorders>
+              <w:top w:val="single" w:sz="4" w:space="0" w:color="B7C3D0"/>
+              <w:left w:val="single" w:sz="4" w:space="0" w:color="B7C3D0"/>
+              <w:bottom w:val="single" w:sz="4" w:space="0" w:color="B7C3D0"/>
+              <w:right w:val="single" w:sz="4" w:space="0" w:color="B7C3D0"/>
+              <w:insideH w:val="single" w:sz="4" w:space="0" w:color="B7C3D0"/>
+              <w:insideV w:val="single" w:sz="4" w:space="0" w:color="B7C3D0"/>
+            </w:tcBorders>
+            <w:shd w:fill="DDEBF7"/>
+            <w:tcMar>
+              <w:top w:w="80" w:type="dxa"/>
+              <w:bottom w:w="80" w:type="dxa"/>
+              <w:start w:w="120" w:type="dxa"/>
+              <w:end w:w="120" w:type="dxa"/>
+            </w:tcMar>
+          </w:tcPr>
+          <w:p>
+            <w:pPr>
+              <w:spacing w:before="0" w:after="0" w:line="240" w:lineRule="auto"/>
+              <w:jc w:val="center"/>
+            </w:pPr>
+            <w:r/>
+            <w:r>
+              <w:rPr>
+                <w:rFonts w:ascii="Calibri" w:hAnsi="Calibri"/>
+                <w:b/>
+                <w:i w:val="0"/>
+                <w:color w:val="000000"/>
+                <w:sz w:val="17"/>
+              </w:rPr>
+              <w:t>9.88%</w:t>
+            </w:r>
+          </w:p>
+        </w:tc>
+        <w:tc>
+          <w:tcPr>
+            <w:tcW w:type="dxa" w:w="2200"/>
+            <w:vAlign w:val="center"/>
+            <w:tcBorders>
+              <w:top w:val="single" w:sz="4" w:space="0" w:color="B7C3D0"/>
+              <w:left w:val="single" w:sz="4" w:space="0" w:color="B7C3D0"/>
+              <w:bottom w:val="single" w:sz="4" w:space="0" w:color="B7C3D0"/>
+              <w:right w:val="single" w:sz="4" w:space="0" w:color="B7C3D0"/>
+              <w:insideH w:val="single" w:sz="4" w:space="0" w:color="B7C3D0"/>
+              <w:insideV w:val="single" w:sz="4" w:space="0" w:color="B7C3D0"/>
+            </w:tcBorders>
+            <w:tcMar>
+              <w:top w:w="80" w:type="dxa"/>
+              <w:bottom w:w="80" w:type="dxa"/>
+              <w:start w:w="120" w:type="dxa"/>
+              <w:end w:w="120" w:type="dxa"/>
+            </w:tcMar>
+          </w:tcPr>
+          <w:p>
+            <w:pPr>
+              <w:spacing w:before="0" w:after="0" w:line="240" w:lineRule="auto"/>
+              <w:jc w:val="left"/>
+            </w:pPr>
+            <w:r/>
+            <w:r>
+              <w:rPr>
+                <w:rFonts w:ascii="Calibri" w:hAnsi="Calibri"/>
+                <w:b w:val="0"/>
+                <w:i w:val="0"/>
+                <w:color w:val="000000"/>
+                <w:sz w:val="17"/>
+              </w:rPr>
+              <w:t>Up to $575k</w:t>
+            </w:r>
+          </w:p>
+        </w:tc>
+        <w:tc>
+          <w:tcPr>
+            <w:tcW w:type="dxa" w:w="1260"/>
+            <w:vAlign w:val="center"/>
+            <w:tcBorders>
+              <w:top w:val="single" w:sz="4" w:space="0" w:color="B7C3D0"/>
+              <w:left w:val="single" w:sz="4" w:space="0" w:color="B7C3D0"/>
+              <w:bottom w:val="single" w:sz="4" w:space="0" w:color="B7C3D0"/>
+              <w:right w:val="single" w:sz="4" w:space="0" w:color="B7C3D0"/>
+              <w:insideH w:val="single" w:sz="4" w:space="0" w:color="B7C3D0"/>
+              <w:insideV w:val="single" w:sz="4" w:space="0" w:color="B7C3D0"/>
+            </w:tcBorders>
+            <w:tcMar>
+              <w:top w:w="80" w:type="dxa"/>
+              <w:bottom w:w="80" w:type="dxa"/>
+              <w:start w:w="120" w:type="dxa"/>
+              <w:end w:w="120" w:type="dxa"/>
+            </w:tcMar>
+          </w:tcPr>
+          <w:p>
+            <w:pPr>
+              <w:spacing w:before="0" w:after="0" w:line="240" w:lineRule="auto"/>
+              <w:jc w:val="center"/>
+            </w:pPr>
+            <w:r/>
+            <w:r>
+              <w:rPr>
+                <w:rFonts w:ascii="Calibri" w:hAnsi="Calibri"/>
+                <w:b w:val="0"/>
+                <w:i w:val="0"/>
+                <w:color w:val="000000"/>
+                <w:sz w:val="17"/>
+              </w:rPr>
+              <w:t>15.06%</w:t>
+            </w:r>
+          </w:p>
+        </w:tc>
+      </w:tr>
+      <w:tr>
+        <w:trPr/>
+        <w:tc>
+          <w:tcPr>
+            <w:tcW w:type="dxa" w:w="1800"/>
+            <w:vAlign w:val="center"/>
+            <w:tcBorders>
+              <w:top w:val="single" w:sz="4" w:space="0" w:color="B7C3D0"/>
+              <w:left w:val="single" w:sz="4" w:space="0" w:color="B7C3D0"/>
+              <w:bottom w:val="single" w:sz="4" w:space="0" w:color="B7C3D0"/>
+              <w:right w:val="single" w:sz="4" w:space="0" w:color="B7C3D0"/>
+              <w:insideH w:val="single" w:sz="4" w:space="0" w:color="B7C3D0"/>
+              <w:insideV w:val="single" w:sz="4" w:space="0" w:color="B7C3D0"/>
+            </w:tcBorders>
+            <w:tcMar>
+              <w:top w:w="80" w:type="dxa"/>
+              <w:bottom w:w="80" w:type="dxa"/>
+              <w:start w:w="120" w:type="dxa"/>
+              <w:end w:w="120" w:type="dxa"/>
+            </w:tcMar>
+          </w:tcPr>
+          <w:p>
+            <w:pPr>
+              <w:spacing w:before="0" w:after="0" w:line="240" w:lineRule="auto"/>
+              <w:jc w:val="left"/>
+            </w:pPr>
+            <w:r/>
+            <w:r>
+              <w:rPr>
+                <w:rFonts w:ascii="Calibri" w:hAnsi="Calibri"/>
+                <w:b w:val="0"/>
+                <w:i w:val="0"/>
+                <w:color w:val="000000"/>
+                <w:sz w:val="17"/>
+              </w:rPr>
+              <w:t>LightGBM</w:t>
+            </w:r>
+          </w:p>
+        </w:tc>
+        <w:tc>
+          <w:tcPr>
+            <w:tcW w:type="dxa" w:w="3000"/>
+            <w:vAlign w:val="center"/>
+            <w:tcBorders>
+              <w:top w:val="single" w:sz="4" w:space="0" w:color="B7C3D0"/>
+              <w:left w:val="single" w:sz="4" w:space="0" w:color="B7C3D0"/>
+              <w:bottom w:val="single" w:sz="4" w:space="0" w:color="B7C3D0"/>
+              <w:right w:val="single" w:sz="4" w:space="0" w:color="B7C3D0"/>
+              <w:insideH w:val="single" w:sz="4" w:space="0" w:color="B7C3D0"/>
+              <w:insideV w:val="single" w:sz="4" w:space="0" w:color="B7C3D0"/>
+            </w:tcBorders>
+            <w:shd w:fill="DDEBF7"/>
+            <w:tcMar>
+              <w:top w:w="80" w:type="dxa"/>
+              <w:bottom w:w="80" w:type="dxa"/>
+              <w:start w:w="120" w:type="dxa"/>
+              <w:end w:w="120" w:type="dxa"/>
+            </w:tcMar>
+          </w:tcPr>
+          <w:p>
+            <w:pPr>
+              <w:spacing w:before="0" w:after="0" w:line="240" w:lineRule="auto"/>
+              <w:jc w:val="left"/>
+            </w:pPr>
+            <w:r/>
+            <w:r>
+              <w:rPr>
+                <w:rFonts w:ascii="Calibri" w:hAnsi="Calibri"/>
+                <w:b w:val="0"/>
+                <w:i w:val="0"/>
+                <w:color w:val="000000"/>
+                <w:sz w:val="17"/>
+              </w:rPr>
+              <w:t>$800k-$1.1M; $575k-$800k</w:t>
+            </w:r>
+          </w:p>
+        </w:tc>
+        <w:tc>
+          <w:tcPr>
+            <w:tcW w:type="dxa" w:w="1100"/>
+            <w:vAlign w:val="center"/>
+            <w:tcBorders>
+              <w:top w:val="single" w:sz="4" w:space="0" w:color="B7C3D0"/>
+              <w:left w:val="single" w:sz="4" w:space="0" w:color="B7C3D0"/>
+              <w:bottom w:val="single" w:sz="4" w:space="0" w:color="B7C3D0"/>
+              <w:right w:val="single" w:sz="4" w:space="0" w:color="B7C3D0"/>
+              <w:insideH w:val="single" w:sz="4" w:space="0" w:color="B7C3D0"/>
+              <w:insideV w:val="single" w:sz="4" w:space="0" w:color="B7C3D0"/>
+            </w:tcBorders>
+            <w:shd w:fill="DDEBF7"/>
+            <w:tcMar>
+              <w:top w:w="80" w:type="dxa"/>
+              <w:bottom w:w="80" w:type="dxa"/>
+              <w:start w:w="120" w:type="dxa"/>
+              <w:end w:w="120" w:type="dxa"/>
+            </w:tcMar>
+          </w:tcPr>
+          <w:p>
+            <w:pPr>
+              <w:spacing w:before="0" w:after="0" w:line="240" w:lineRule="auto"/>
+              <w:jc w:val="center"/>
+            </w:pPr>
+            <w:r/>
+            <w:r>
+              <w:rPr>
+                <w:rFonts w:ascii="Calibri" w:hAnsi="Calibri"/>
+                <w:b/>
+                <w:i w:val="0"/>
+                <w:color w:val="000000"/>
+                <w:sz w:val="17"/>
+              </w:rPr>
+              <w:t>10.34%</w:t>
+            </w:r>
+          </w:p>
+        </w:tc>
+        <w:tc>
+          <w:tcPr>
+            <w:tcW w:type="dxa" w:w="2200"/>
+            <w:vAlign w:val="center"/>
+            <w:tcBorders>
+              <w:top w:val="single" w:sz="4" w:space="0" w:color="B7C3D0"/>
+              <w:left w:val="single" w:sz="4" w:space="0" w:color="B7C3D0"/>
+              <w:bottom w:val="single" w:sz="4" w:space="0" w:color="B7C3D0"/>
+              <w:right w:val="single" w:sz="4" w:space="0" w:color="B7C3D0"/>
+              <w:insideH w:val="single" w:sz="4" w:space="0" w:color="B7C3D0"/>
+              <w:insideV w:val="single" w:sz="4" w:space="0" w:color="B7C3D0"/>
+            </w:tcBorders>
+            <w:tcMar>
+              <w:top w:w="80" w:type="dxa"/>
+              <w:bottom w:w="80" w:type="dxa"/>
+              <w:start w:w="120" w:type="dxa"/>
+              <w:end w:w="120" w:type="dxa"/>
+            </w:tcMar>
+          </w:tcPr>
+          <w:p>
+            <w:pPr>
+              <w:spacing w:before="0" w:after="0" w:line="240" w:lineRule="auto"/>
+              <w:jc w:val="left"/>
+            </w:pPr>
+            <w:r/>
+            <w:r>
+              <w:rPr>
+                <w:rFonts w:ascii="Calibri" w:hAnsi="Calibri"/>
+                <w:b w:val="0"/>
+                <w:i w:val="0"/>
+                <w:color w:val="000000"/>
+                <w:sz w:val="17"/>
+              </w:rPr>
+              <w:t>Up to $575k</w:t>
+            </w:r>
+          </w:p>
+        </w:tc>
+        <w:tc>
+          <w:tcPr>
+            <w:tcW w:type="dxa" w:w="1260"/>
+            <w:vAlign w:val="center"/>
+            <w:tcBorders>
+              <w:top w:val="single" w:sz="4" w:space="0" w:color="B7C3D0"/>
+              <w:left w:val="single" w:sz="4" w:space="0" w:color="B7C3D0"/>
+              <w:bottom w:val="single" w:sz="4" w:space="0" w:color="B7C3D0"/>
+              <w:right w:val="single" w:sz="4" w:space="0" w:color="B7C3D0"/>
+              <w:insideH w:val="single" w:sz="4" w:space="0" w:color="B7C3D0"/>
+              <w:insideV w:val="single" w:sz="4" w:space="0" w:color="B7C3D0"/>
+            </w:tcBorders>
+            <w:tcMar>
+              <w:top w:w="80" w:type="dxa"/>
+              <w:bottom w:w="80" w:type="dxa"/>
+              <w:start w:w="120" w:type="dxa"/>
+              <w:end w:w="120" w:type="dxa"/>
+            </w:tcMar>
+          </w:tcPr>
+          <w:p>
+            <w:pPr>
+              <w:spacing w:before="0" w:after="0" w:line="240" w:lineRule="auto"/>
+              <w:jc w:val="center"/>
+            </w:pPr>
+            <w:r/>
+            <w:r>
+              <w:rPr>
+                <w:rFonts w:ascii="Calibri" w:hAnsi="Calibri"/>
+                <w:b w:val="0"/>
+                <w:i w:val="0"/>
+                <w:color w:val="000000"/>
+                <w:sz w:val="17"/>
+              </w:rPr>
+              <w:t>14.98%</w:t>
+            </w:r>
+          </w:p>
+        </w:tc>
+      </w:tr>
+      <w:tr>
+        <w:trPr/>
+        <w:tc>
+          <w:tcPr>
+            <w:tcW w:type="dxa" w:w="1800"/>
+            <w:vAlign w:val="center"/>
+            <w:tcBorders>
+              <w:top w:val="single" w:sz="4" w:space="0" w:color="B7C3D0"/>
+              <w:left w:val="single" w:sz="4" w:space="0" w:color="B7C3D0"/>
+              <w:bottom w:val="single" w:sz="4" w:space="0" w:color="B7C3D0"/>
+              <w:right w:val="single" w:sz="4" w:space="0" w:color="B7C3D0"/>
+              <w:insideH w:val="single" w:sz="4" w:space="0" w:color="B7C3D0"/>
+              <w:insideV w:val="single" w:sz="4" w:space="0" w:color="B7C3D0"/>
+            </w:tcBorders>
+            <w:tcMar>
+              <w:top w:w="80" w:type="dxa"/>
+              <w:bottom w:w="80" w:type="dxa"/>
+              <w:start w:w="120" w:type="dxa"/>
+              <w:end w:w="120" w:type="dxa"/>
+            </w:tcMar>
+          </w:tcPr>
+          <w:p>
+            <w:pPr>
+              <w:spacing w:before="0" w:after="0" w:line="240" w:lineRule="auto"/>
+              <w:jc w:val="left"/>
+            </w:pPr>
+            <w:r/>
+            <w:r>
+              <w:rPr>
+                <w:rFonts w:ascii="Calibri" w:hAnsi="Calibri"/>
+                <w:b w:val="0"/>
+                <w:i w:val="0"/>
+                <w:color w:val="000000"/>
+                <w:sz w:val="17"/>
+              </w:rPr>
+              <w:t>Random Forest</w:t>
+            </w:r>
+          </w:p>
+        </w:tc>
+        <w:tc>
+          <w:tcPr>
+            <w:tcW w:type="dxa" w:w="3000"/>
+            <w:vAlign w:val="center"/>
+            <w:tcBorders>
+              <w:top w:val="single" w:sz="4" w:space="0" w:color="B7C3D0"/>
+              <w:left w:val="single" w:sz="4" w:space="0" w:color="B7C3D0"/>
+              <w:bottom w:val="single" w:sz="4" w:space="0" w:color="B7C3D0"/>
+              <w:right w:val="single" w:sz="4" w:space="0" w:color="B7C3D0"/>
+              <w:insideH w:val="single" w:sz="4" w:space="0" w:color="B7C3D0"/>
+              <w:insideV w:val="single" w:sz="4" w:space="0" w:color="B7C3D0"/>
+            </w:tcBorders>
+            <w:shd w:fill="DDEBF7"/>
+            <w:tcMar>
+              <w:top w:w="80" w:type="dxa"/>
+              <w:bottom w:w="80" w:type="dxa"/>
+              <w:start w:w="120" w:type="dxa"/>
+              <w:end w:w="120" w:type="dxa"/>
+            </w:tcMar>
+          </w:tcPr>
+          <w:p>
+            <w:pPr>
+              <w:spacing w:before="0" w:after="0" w:line="240" w:lineRule="auto"/>
+              <w:jc w:val="left"/>
+            </w:pPr>
+            <w:r/>
+            <w:r>
+              <w:rPr>
+                <w:rFonts w:ascii="Calibri" w:hAnsi="Calibri"/>
+                <w:b w:val="0"/>
+                <w:i w:val="0"/>
+                <w:color w:val="000000"/>
+                <w:sz w:val="17"/>
+              </w:rPr>
+              <w:t>$575k-$800k; $800k-$1.1M</w:t>
+            </w:r>
+          </w:p>
+        </w:tc>
+        <w:tc>
+          <w:tcPr>
+            <w:tcW w:type="dxa" w:w="1100"/>
+            <w:vAlign w:val="center"/>
+            <w:tcBorders>
+              <w:top w:val="single" w:sz="4" w:space="0" w:color="B7C3D0"/>
+              <w:left w:val="single" w:sz="4" w:space="0" w:color="B7C3D0"/>
+              <w:bottom w:val="single" w:sz="4" w:space="0" w:color="B7C3D0"/>
+              <w:right w:val="single" w:sz="4" w:space="0" w:color="B7C3D0"/>
+              <w:insideH w:val="single" w:sz="4" w:space="0" w:color="B7C3D0"/>
+              <w:insideV w:val="single" w:sz="4" w:space="0" w:color="B7C3D0"/>
+            </w:tcBorders>
+            <w:shd w:fill="DDEBF7"/>
+            <w:tcMar>
+              <w:top w:w="80" w:type="dxa"/>
+              <w:bottom w:w="80" w:type="dxa"/>
+              <w:start w:w="120" w:type="dxa"/>
+              <w:end w:w="120" w:type="dxa"/>
+            </w:tcMar>
+          </w:tcPr>
+          <w:p>
+            <w:pPr>
+              <w:spacing w:before="0" w:after="0" w:line="240" w:lineRule="auto"/>
+              <w:jc w:val="center"/>
+            </w:pPr>
+            <w:r/>
+            <w:r>
+              <w:rPr>
+                <w:rFonts w:ascii="Calibri" w:hAnsi="Calibri"/>
+                <w:b/>
+                <w:i w:val="0"/>
+                <w:color w:val="000000"/>
+                <w:sz w:val="17"/>
+              </w:rPr>
+              <w:t>6.24%</w:t>
+            </w:r>
+          </w:p>
+        </w:tc>
+        <w:tc>
+          <w:tcPr>
+            <w:tcW w:type="dxa" w:w="2200"/>
+            <w:vAlign w:val="center"/>
+            <w:tcBorders>
+              <w:top w:val="single" w:sz="4" w:space="0" w:color="B7C3D0"/>
+              <w:left w:val="single" w:sz="4" w:space="0" w:color="B7C3D0"/>
+              <w:bottom w:val="single" w:sz="4" w:space="0" w:color="B7C3D0"/>
+              <w:right w:val="single" w:sz="4" w:space="0" w:color="B7C3D0"/>
+              <w:insideH w:val="single" w:sz="4" w:space="0" w:color="B7C3D0"/>
+              <w:insideV w:val="single" w:sz="4" w:space="0" w:color="B7C3D0"/>
+            </w:tcBorders>
+            <w:tcMar>
+              <w:top w:w="80" w:type="dxa"/>
+              <w:bottom w:w="80" w:type="dxa"/>
+              <w:start w:w="120" w:type="dxa"/>
+              <w:end w:w="120" w:type="dxa"/>
+            </w:tcMar>
+          </w:tcPr>
+          <w:p>
+            <w:pPr>
+              <w:spacing w:before="0" w:after="0" w:line="240" w:lineRule="auto"/>
+              <w:jc w:val="left"/>
+            </w:pPr>
+            <w:r/>
+            <w:r>
+              <w:rPr>
+                <w:rFonts w:ascii="Calibri" w:hAnsi="Calibri"/>
+                <w:b w:val="0"/>
+                <w:i w:val="0"/>
+                <w:color w:val="000000"/>
+                <w:sz w:val="17"/>
+              </w:rPr>
+              <w:t>$1.67M+</w:t>
+            </w:r>
+          </w:p>
+        </w:tc>
+        <w:tc>
+          <w:tcPr>
+            <w:tcW w:type="dxa" w:w="1260"/>
+            <w:vAlign w:val="center"/>
+            <w:tcBorders>
+              <w:top w:val="single" w:sz="4" w:space="0" w:color="B7C3D0"/>
+              <w:left w:val="single" w:sz="4" w:space="0" w:color="B7C3D0"/>
+              <w:bottom w:val="single" w:sz="4" w:space="0" w:color="B7C3D0"/>
+              <w:right w:val="single" w:sz="4" w:space="0" w:color="B7C3D0"/>
+              <w:insideH w:val="single" w:sz="4" w:space="0" w:color="B7C3D0"/>
+              <w:insideV w:val="single" w:sz="4" w:space="0" w:color="B7C3D0"/>
+            </w:tcBorders>
+            <w:tcMar>
+              <w:top w:w="80" w:type="dxa"/>
+              <w:bottom w:w="80" w:type="dxa"/>
+              <w:start w:w="120" w:type="dxa"/>
+              <w:end w:w="120" w:type="dxa"/>
+            </w:tcMar>
+          </w:tcPr>
+          <w:p>
+            <w:pPr>
+              <w:spacing w:before="0" w:after="0" w:line="240" w:lineRule="auto"/>
+              <w:jc w:val="center"/>
+            </w:pPr>
+            <w:r/>
+            <w:r>
+              <w:rPr>
+                <w:rFonts w:ascii="Calibri" w:hAnsi="Calibri"/>
+                <w:b w:val="0"/>
+                <w:i w:val="0"/>
+                <w:color w:val="000000"/>
+                <w:sz w:val="17"/>
+              </w:rPr>
+              <w:t>14.10%</w:t>
+            </w:r>
+          </w:p>
+        </w:tc>
+      </w:tr>
+      <w:tr>
+        <w:trPr/>
+        <w:tc>
+          <w:tcPr>
+            <w:tcW w:type="dxa" w:w="1800"/>
+            <w:vAlign w:val="center"/>
+            <w:tcBorders>
+              <w:top w:val="single" w:sz="4" w:space="0" w:color="B7C3D0"/>
+              <w:left w:val="single" w:sz="4" w:space="0" w:color="B7C3D0"/>
+              <w:bottom w:val="single" w:sz="4" w:space="0" w:color="B7C3D0"/>
+              <w:right w:val="single" w:sz="4" w:space="0" w:color="B7C3D0"/>
+              <w:insideH w:val="single" w:sz="4" w:space="0" w:color="B7C3D0"/>
+              <w:insideV w:val="single" w:sz="4" w:space="0" w:color="B7C3D0"/>
+            </w:tcBorders>
+            <w:tcMar>
+              <w:top w:w="80" w:type="dxa"/>
+              <w:bottom w:w="80" w:type="dxa"/>
+              <w:start w:w="120" w:type="dxa"/>
+              <w:end w:w="120" w:type="dxa"/>
+            </w:tcMar>
+          </w:tcPr>
+          <w:p>
+            <w:pPr>
+              <w:spacing w:before="0" w:after="0" w:line="240" w:lineRule="auto"/>
+              <w:jc w:val="left"/>
+            </w:pPr>
+            <w:r/>
+            <w:r>
+              <w:rPr>
+                <w:rFonts w:ascii="Calibri" w:hAnsi="Calibri"/>
+                <w:b w:val="0"/>
+                <w:i w:val="0"/>
+                <w:color w:val="000000"/>
+                <w:sz w:val="17"/>
+              </w:rPr>
+              <w:t>Decision Tree</w:t>
+            </w:r>
+          </w:p>
+        </w:tc>
+        <w:tc>
+          <w:tcPr>
+            <w:tcW w:type="dxa" w:w="3000"/>
+            <w:vAlign w:val="center"/>
+            <w:tcBorders>
+              <w:top w:val="single" w:sz="4" w:space="0" w:color="B7C3D0"/>
+              <w:left w:val="single" w:sz="4" w:space="0" w:color="B7C3D0"/>
+              <w:bottom w:val="single" w:sz="4" w:space="0" w:color="B7C3D0"/>
+              <w:right w:val="single" w:sz="4" w:space="0" w:color="B7C3D0"/>
+              <w:insideH w:val="single" w:sz="4" w:space="0" w:color="B7C3D0"/>
+              <w:insideV w:val="single" w:sz="4" w:space="0" w:color="B7C3D0"/>
+            </w:tcBorders>
+            <w:shd w:fill="DDEBF7"/>
+            <w:tcMar>
+              <w:top w:w="80" w:type="dxa"/>
+              <w:bottom w:w="80" w:type="dxa"/>
+              <w:start w:w="120" w:type="dxa"/>
+              <w:end w:w="120" w:type="dxa"/>
+            </w:tcMar>
+          </w:tcPr>
+          <w:p>
+            <w:pPr>
+              <w:spacing w:before="0" w:after="0" w:line="240" w:lineRule="auto"/>
+              <w:jc w:val="left"/>
+            </w:pPr>
+            <w:r/>
+            <w:r>
+              <w:rPr>
+                <w:rFonts w:ascii="Calibri" w:hAnsi="Calibri"/>
+                <w:b w:val="0"/>
+                <w:i w:val="0"/>
+                <w:color w:val="000000"/>
+                <w:sz w:val="17"/>
+              </w:rPr>
+              <w:t>$575k-$800k; $800k-$1.1M</w:t>
+            </w:r>
+          </w:p>
+        </w:tc>
+        <w:tc>
+          <w:tcPr>
+            <w:tcW w:type="dxa" w:w="1100"/>
+            <w:vAlign w:val="center"/>
+            <w:tcBorders>
+              <w:top w:val="single" w:sz="4" w:space="0" w:color="B7C3D0"/>
+              <w:left w:val="single" w:sz="4" w:space="0" w:color="B7C3D0"/>
+              <w:bottom w:val="single" w:sz="4" w:space="0" w:color="B7C3D0"/>
+              <w:right w:val="single" w:sz="4" w:space="0" w:color="B7C3D0"/>
+              <w:insideH w:val="single" w:sz="4" w:space="0" w:color="B7C3D0"/>
+              <w:insideV w:val="single" w:sz="4" w:space="0" w:color="B7C3D0"/>
+            </w:tcBorders>
+            <w:shd w:fill="DDEBF7"/>
+            <w:tcMar>
+              <w:top w:w="80" w:type="dxa"/>
+              <w:bottom w:w="80" w:type="dxa"/>
+              <w:start w:w="120" w:type="dxa"/>
+              <w:end w:w="120" w:type="dxa"/>
+            </w:tcMar>
+          </w:tcPr>
+          <w:p>
+            <w:pPr>
+              <w:spacing w:before="0" w:after="0" w:line="240" w:lineRule="auto"/>
+              <w:jc w:val="center"/>
+            </w:pPr>
+            <w:r/>
+            <w:r>
+              <w:rPr>
+                <w:rFonts w:ascii="Calibri" w:hAnsi="Calibri"/>
+                <w:b/>
+                <w:i w:val="0"/>
+                <w:color w:val="000000"/>
+                <w:sz w:val="17"/>
+              </w:rPr>
+              <w:t>7.90%</w:t>
+            </w:r>
+          </w:p>
+        </w:tc>
+        <w:tc>
+          <w:tcPr>
+            <w:tcW w:type="dxa" w:w="2200"/>
+            <w:vAlign w:val="center"/>
+            <w:tcBorders>
+              <w:top w:val="single" w:sz="4" w:space="0" w:color="B7C3D0"/>
+              <w:left w:val="single" w:sz="4" w:space="0" w:color="B7C3D0"/>
+              <w:bottom w:val="single" w:sz="4" w:space="0" w:color="B7C3D0"/>
+              <w:right w:val="single" w:sz="4" w:space="0" w:color="B7C3D0"/>
+              <w:insideH w:val="single" w:sz="4" w:space="0" w:color="B7C3D0"/>
+              <w:insideV w:val="single" w:sz="4" w:space="0" w:color="B7C3D0"/>
+            </w:tcBorders>
+            <w:tcMar>
+              <w:top w:w="80" w:type="dxa"/>
+              <w:bottom w:w="80" w:type="dxa"/>
+              <w:start w:w="120" w:type="dxa"/>
+              <w:end w:w="120" w:type="dxa"/>
+            </w:tcMar>
+          </w:tcPr>
+          <w:p>
+            <w:pPr>
+              <w:spacing w:before="0" w:after="0" w:line="240" w:lineRule="auto"/>
+              <w:jc w:val="left"/>
+            </w:pPr>
+            <w:r/>
+            <w:r>
+              <w:rPr>
+                <w:rFonts w:ascii="Calibri" w:hAnsi="Calibri"/>
+                <w:b w:val="0"/>
+                <w:i w:val="0"/>
+                <w:color w:val="000000"/>
+                <w:sz w:val="17"/>
+              </w:rPr>
+              <w:t>$1.67M+</w:t>
+            </w:r>
+          </w:p>
+        </w:tc>
+        <w:tc>
+          <w:tcPr>
+            <w:tcW w:type="dxa" w:w="1260"/>
+            <w:vAlign w:val="center"/>
+            <w:tcBorders>
+              <w:top w:val="single" w:sz="4" w:space="0" w:color="B7C3D0"/>
+              <w:left w:val="single" w:sz="4" w:space="0" w:color="B7C3D0"/>
+              <w:bottom w:val="single" w:sz="4" w:space="0" w:color="B7C3D0"/>
+              <w:right w:val="single" w:sz="4" w:space="0" w:color="B7C3D0"/>
+              <w:insideH w:val="single" w:sz="4" w:space="0" w:color="B7C3D0"/>
+              <w:insideV w:val="single" w:sz="4" w:space="0" w:color="B7C3D0"/>
+            </w:tcBorders>
+            <w:tcMar>
+              <w:top w:w="80" w:type="dxa"/>
+              <w:bottom w:w="80" w:type="dxa"/>
+              <w:start w:w="120" w:type="dxa"/>
+              <w:end w:w="120" w:type="dxa"/>
+            </w:tcMar>
+          </w:tcPr>
+          <w:p>
+            <w:pPr>
+              <w:spacing w:before="0" w:after="0" w:line="240" w:lineRule="auto"/>
+              <w:jc w:val="center"/>
+            </w:pPr>
+            <w:r/>
+            <w:r>
+              <w:rPr>
+                <w:rFonts w:ascii="Calibri" w:hAnsi="Calibri"/>
+                <w:b w:val="0"/>
+                <w:i w:val="0"/>
+                <w:color w:val="000000"/>
+                <w:sz w:val="17"/>
+              </w:rPr>
+              <w:t>16.64%</w:t>
+            </w:r>
+          </w:p>
+        </w:tc>
+      </w:tr>
+      <w:tr>
+        <w:trPr/>
+        <w:tc>
+          <w:tcPr>
+            <w:tcW w:type="dxa" w:w="1800"/>
+            <w:vAlign w:val="center"/>
+            <w:tcBorders>
+              <w:top w:val="single" w:sz="4" w:space="0" w:color="B7C3D0"/>
+              <w:left w:val="single" w:sz="4" w:space="0" w:color="B7C3D0"/>
+              <w:bottom w:val="single" w:sz="4" w:space="0" w:color="B7C3D0"/>
+              <w:right w:val="single" w:sz="4" w:space="0" w:color="B7C3D0"/>
+              <w:insideH w:val="single" w:sz="4" w:space="0" w:color="B7C3D0"/>
+              <w:insideV w:val="single" w:sz="4" w:space="0" w:color="B7C3D0"/>
+            </w:tcBorders>
+            <w:tcMar>
+              <w:top w:w="80" w:type="dxa"/>
+              <w:bottom w:w="80" w:type="dxa"/>
+              <w:start w:w="120" w:type="dxa"/>
+              <w:end w:w="120" w:type="dxa"/>
+            </w:tcMar>
+          </w:tcPr>
+          <w:p>
+            <w:pPr>
+              <w:spacing w:before="0" w:after="0" w:line="240" w:lineRule="auto"/>
+              <w:jc w:val="left"/>
+            </w:pPr>
+            <w:r/>
+            <w:r>
+              <w:rPr>
+                <w:rFonts w:ascii="Calibri" w:hAnsi="Calibri"/>
+                <w:b w:val="0"/>
+                <w:i w:val="0"/>
+                <w:color w:val="000000"/>
+                <w:sz w:val="17"/>
+              </w:rPr>
+              <w:t>Linear Regression</w:t>
+            </w:r>
+          </w:p>
+        </w:tc>
+        <w:tc>
+          <w:tcPr>
+            <w:tcW w:type="dxa" w:w="3000"/>
+            <w:vAlign w:val="center"/>
+            <w:tcBorders>
+              <w:top w:val="single" w:sz="4" w:space="0" w:color="B7C3D0"/>
+              <w:left w:val="single" w:sz="4" w:space="0" w:color="B7C3D0"/>
+              <w:bottom w:val="single" w:sz="4" w:space="0" w:color="B7C3D0"/>
+              <w:right w:val="single" w:sz="4" w:space="0" w:color="B7C3D0"/>
+              <w:insideH w:val="single" w:sz="4" w:space="0" w:color="B7C3D0"/>
+              <w:insideV w:val="single" w:sz="4" w:space="0" w:color="B7C3D0"/>
+            </w:tcBorders>
+            <w:shd w:fill="DDEBF7"/>
+            <w:tcMar>
+              <w:top w:w="80" w:type="dxa"/>
+              <w:bottom w:w="80" w:type="dxa"/>
+              <w:start w:w="120" w:type="dxa"/>
+              <w:end w:w="120" w:type="dxa"/>
+            </w:tcMar>
+          </w:tcPr>
+          <w:p>
+            <w:pPr>
+              <w:spacing w:before="0" w:after="0" w:line="240" w:lineRule="auto"/>
+              <w:jc w:val="left"/>
+            </w:pPr>
+            <w:r/>
+            <w:r>
+              <w:rPr>
+                <w:rFonts w:ascii="Calibri" w:hAnsi="Calibri"/>
+                <w:b w:val="0"/>
+                <w:i w:val="0"/>
+                <w:color w:val="000000"/>
+                <w:sz w:val="17"/>
+              </w:rPr>
+              <w:t>$1.1M-$1.67M; $800k-$1.1M</w:t>
+            </w:r>
+          </w:p>
+        </w:tc>
+        <w:tc>
+          <w:tcPr>
+            <w:tcW w:type="dxa" w:w="1100"/>
+            <w:vAlign w:val="center"/>
+            <w:tcBorders>
+              <w:top w:val="single" w:sz="4" w:space="0" w:color="B7C3D0"/>
+              <w:left w:val="single" w:sz="4" w:space="0" w:color="B7C3D0"/>
+              <w:bottom w:val="single" w:sz="4" w:space="0" w:color="B7C3D0"/>
+              <w:right w:val="single" w:sz="4" w:space="0" w:color="B7C3D0"/>
+              <w:insideH w:val="single" w:sz="4" w:space="0" w:color="B7C3D0"/>
+              <w:insideV w:val="single" w:sz="4" w:space="0" w:color="B7C3D0"/>
+            </w:tcBorders>
+            <w:shd w:fill="DDEBF7"/>
+            <w:tcMar>
+              <w:top w:w="80" w:type="dxa"/>
+              <w:bottom w:w="80" w:type="dxa"/>
+              <w:start w:w="120" w:type="dxa"/>
+              <w:end w:w="120" w:type="dxa"/>
+            </w:tcMar>
+          </w:tcPr>
+          <w:p>
+            <w:pPr>
+              <w:spacing w:before="0" w:after="0" w:line="240" w:lineRule="auto"/>
+              <w:jc w:val="center"/>
+            </w:pPr>
+            <w:r/>
+            <w:r>
+              <w:rPr>
+                <w:rFonts w:ascii="Calibri" w:hAnsi="Calibri"/>
+                <w:b/>
+                <w:i w:val="0"/>
+                <w:color w:val="000000"/>
+                <w:sz w:val="17"/>
+              </w:rPr>
+              <w:t>13.78%</w:t>
+            </w:r>
+          </w:p>
+        </w:tc>
+        <w:tc>
+          <w:tcPr>
+            <w:tcW w:type="dxa" w:w="2200"/>
+            <w:vAlign w:val="center"/>
+            <w:tcBorders>
+              <w:top w:val="single" w:sz="4" w:space="0" w:color="B7C3D0"/>
+              <w:left w:val="single" w:sz="4" w:space="0" w:color="B7C3D0"/>
+              <w:bottom w:val="single" w:sz="4" w:space="0" w:color="B7C3D0"/>
+              <w:right w:val="single" w:sz="4" w:space="0" w:color="B7C3D0"/>
+              <w:insideH w:val="single" w:sz="4" w:space="0" w:color="B7C3D0"/>
+              <w:insideV w:val="single" w:sz="4" w:space="0" w:color="B7C3D0"/>
+            </w:tcBorders>
+            <w:tcMar>
+              <w:top w:w="80" w:type="dxa"/>
+              <w:bottom w:w="80" w:type="dxa"/>
+              <w:start w:w="120" w:type="dxa"/>
+              <w:end w:w="120" w:type="dxa"/>
+            </w:tcMar>
+          </w:tcPr>
+          <w:p>
+            <w:pPr>
+              <w:spacing w:before="0" w:after="0" w:line="240" w:lineRule="auto"/>
+              <w:jc w:val="left"/>
+            </w:pPr>
+            <w:r/>
+            <w:r>
+              <w:rPr>
+                <w:rFonts w:ascii="Calibri" w:hAnsi="Calibri"/>
+                <w:b w:val="0"/>
+                <w:i w:val="0"/>
+                <w:color w:val="000000"/>
+                <w:sz w:val="17"/>
+              </w:rPr>
+              <w:t>Up to $575k</w:t>
+            </w:r>
+          </w:p>
+        </w:tc>
+        <w:tc>
+          <w:tcPr>
+            <w:tcW w:type="dxa" w:w="1260"/>
+            <w:vAlign w:val="center"/>
+            <w:tcBorders>
+              <w:top w:val="single" w:sz="4" w:space="0" w:color="B7C3D0"/>
+              <w:left w:val="single" w:sz="4" w:space="0" w:color="B7C3D0"/>
+              <w:bottom w:val="single" w:sz="4" w:space="0" w:color="B7C3D0"/>
+              <w:right w:val="single" w:sz="4" w:space="0" w:color="B7C3D0"/>
+              <w:insideH w:val="single" w:sz="4" w:space="0" w:color="B7C3D0"/>
+              <w:insideV w:val="single" w:sz="4" w:space="0" w:color="B7C3D0"/>
+            </w:tcBorders>
+            <w:tcMar>
+              <w:top w:w="80" w:type="dxa"/>
+              <w:bottom w:w="80" w:type="dxa"/>
+              <w:start w:w="120" w:type="dxa"/>
+              <w:end w:w="120" w:type="dxa"/>
+            </w:tcMar>
+          </w:tcPr>
+          <w:p>
+            <w:pPr>
+              <w:spacing w:before="0" w:after="0" w:line="240" w:lineRule="auto"/>
+              <w:jc w:val="center"/>
+            </w:pPr>
+            <w:r/>
+            <w:r>
+              <w:rPr>
+                <w:rFonts w:ascii="Calibri" w:hAnsi="Calibri"/>
+                <w:b w:val="0"/>
+                <w:i w:val="0"/>
+                <w:color w:val="000000"/>
+                <w:sz w:val="17"/>
+              </w:rPr>
+              <w:t>27.65%</w:t>
+            </w:r>
+          </w:p>
+        </w:tc>
+      </w:tr>
+    </w:tbl>
+    <w:p>
+      <w:pPr>
+        <w:spacing w:before="80" w:after="140"/>
+      </w:pPr>
+      <w:r>
+        <w:rPr>
+          <w:rFonts w:ascii="Calibri" w:hAnsi="Calibri"/>
+          <w:b w:val="0"/>
+          <w:i/>
+          <w:color w:val="595959"/>
+          <w:sz w:val="17"/>
+        </w:rPr>
+        <w:t>The highest band is open-ended ($1.67M+) and includes luxury outliers. Within-band R² can be negative because each band narrows the range of actual prices; MdAPE is therefore the primary band-ranking measure.</w:t>
+      </w:r>
+    </w:p>
+    <w:p>
+      <w:pPr>
+        <w:pStyle w:val="Heading1"/>
+        <w:keepNext/>
+      </w:pPr>
+      <w:r>
+        <w:t>What performs better by model</w:t>
+      </w:r>
+    </w:p>
+    <w:p>
+      <w:pPr>
+        <w:spacing w:before="0" w:after="100" w:line="259" w:lineRule="auto"/>
+      </w:pPr>
+      <w:r>
+        <w:rPr>
+          <w:rFonts w:ascii="Calibri" w:hAnsi="Calibri"/>
+          <w:b/>
+          <w:i w:val="0"/>
+          <w:color w:val="1F4D78"/>
+          <w:sz w:val="21"/>
+        </w:rPr>
+        <w:t xml:space="preserve">XGBoost. </w:t>
+      </w:r>
+      <w:r>
+        <w:rPr>
+          <w:rFonts w:ascii="Calibri" w:hAnsi="Calibri"/>
+          <w:b w:val="0"/>
+          <w:i w:val="0"/>
+          <w:color w:val="000000"/>
+          <w:sz w:val="21"/>
+        </w:rPr>
+        <w:t>Best in $800k-$1.1M (9.88% MdAPE), with $575k-$800k close behind (10.10%). Its weakest band is Up to $575k (15.06%).</w:t>
+      </w:r>
+    </w:p>
+    <w:p>
+      <w:pPr>
+        <w:spacing w:before="0" w:after="100" w:line="259" w:lineRule="auto"/>
+      </w:pPr>
+      <w:r>
+        <w:rPr>
+          <w:rFonts w:ascii="Calibri" w:hAnsi="Calibri"/>
+          <w:b/>
+          <w:i w:val="0"/>
+          <w:color w:val="1F4D78"/>
+          <w:sz w:val="21"/>
+        </w:rPr>
+        <w:t xml:space="preserve">LightGBM. </w:t>
+      </w:r>
+      <w:r>
+        <w:rPr>
+          <w:rFonts w:ascii="Calibri" w:hAnsi="Calibri"/>
+          <w:b w:val="0"/>
+          <w:i w:val="0"/>
+          <w:color w:val="000000"/>
+          <w:sz w:val="21"/>
+        </w:rPr>
+        <w:t>Also strongest in $800k-$1.1M (10.34% MdAPE), followed by $575k-$800k (10.48%). The weakest band is Up to $575k (14.98%).</w:t>
+      </w:r>
+    </w:p>
+    <w:p>
+      <w:pPr>
+        <w:spacing w:before="0" w:after="100" w:line="259" w:lineRule="auto"/>
+      </w:pPr>
+      <w:r>
+        <w:rPr>
+          <w:rFonts w:ascii="Calibri" w:hAnsi="Calibri"/>
+          <w:b/>
+          <w:i w:val="0"/>
+          <w:color w:val="1F4D78"/>
+          <w:sz w:val="21"/>
+        </w:rPr>
+        <w:t xml:space="preserve">Random Forest. </w:t>
+      </w:r>
+      <w:r>
+        <w:rPr>
+          <w:rFonts w:ascii="Calibri" w:hAnsi="Calibri"/>
+          <w:b w:val="0"/>
+          <w:i w:val="0"/>
+          <w:color w:val="000000"/>
+          <w:sz w:val="21"/>
+        </w:rPr>
+        <w:t>Best in $575k-$800k (6.24% MdAPE) and next-best in $800k-$1.1M (8.20%). It weakens most in $1.67M+ (14.10%).</w:t>
+      </w:r>
+    </w:p>
+    <w:p>
+      <w:pPr>
+        <w:spacing w:before="0" w:after="100" w:line="259" w:lineRule="auto"/>
+      </w:pPr>
+      <w:r>
+        <w:rPr>
+          <w:rFonts w:ascii="Calibri" w:hAnsi="Calibri"/>
+          <w:b/>
+          <w:i w:val="0"/>
+          <w:color w:val="1F4D78"/>
+          <w:sz w:val="21"/>
+        </w:rPr>
+        <w:t xml:space="preserve">Decision Tree. </w:t>
+      </w:r>
+      <w:r>
+        <w:rPr>
+          <w:rFonts w:ascii="Calibri" w:hAnsi="Calibri"/>
+          <w:b w:val="0"/>
+          <w:i w:val="0"/>
+          <w:color w:val="000000"/>
+          <w:sz w:val="21"/>
+        </w:rPr>
+        <w:t>Best in $575k-$800k (7.90% MdAPE), then $800k-$1.1M (9.50%). The open-ended $1.67M+ band is weakest (16.64%), consistent with single-tree variance.</w:t>
+      </w:r>
+    </w:p>
+    <w:p>
+      <w:pPr>
+        <w:spacing w:before="0" w:after="100" w:line="259" w:lineRule="auto"/>
+      </w:pPr>
+      <w:r>
+        <w:rPr>
+          <w:rFonts w:ascii="Calibri" w:hAnsi="Calibri"/>
+          <w:b/>
+          <w:i w:val="0"/>
+          <w:color w:val="1F4D78"/>
+          <w:sz w:val="21"/>
+        </w:rPr>
+        <w:t xml:space="preserve">Linear Regression. </w:t>
+      </w:r>
+      <w:r>
+        <w:rPr>
+          <w:rFonts w:ascii="Calibri" w:hAnsi="Calibri"/>
+          <w:b w:val="0"/>
+          <w:i w:val="0"/>
+          <w:color w:val="000000"/>
+          <w:sz w:val="21"/>
+        </w:rPr>
+        <w:t>Unlike the tree models, its best band shifts upward to $1.1M-$1.67M (13.78% MdAPE), followed by $800k-$1.1M (15.47%). It is weakest in Up to $575k (27.65%).</w:t>
+      </w:r>
+    </w:p>
+    <w:p>
+      <w:pPr>
+        <w:spacing w:before="0" w:after="100" w:line="259" w:lineRule="auto"/>
+      </w:pPr>
+      <w:r>
+        <w:rPr>
+          <w:rFonts w:ascii="Calibri" w:hAnsi="Calibri"/>
+          <w:b/>
+          <w:i w:val="0"/>
+          <w:color w:val="1F4D78"/>
+          <w:sz w:val="21"/>
+        </w:rPr>
+        <w:t xml:space="preserve">Team takeaway. </w:t>
+      </w:r>
+      <w:r>
+        <w:rPr>
+          <w:rFonts w:ascii="Calibri" w:hAnsi="Calibri"/>
+          <w:b w:val="0"/>
+          <w:i w:val="0"/>
+          <w:color w:val="000000"/>
+          <w:sz w:val="21"/>
+        </w:rPr>
+        <w:t>The four tree-based models share a clear middle-market strength from $575k to $1.1M. Lower-priced sales show a long tail of relative misses, while $1.67M+ sales drive much larger dollar errors. Future model selection should keep statewide and band-level metrics together rather than choosing one model from the aggregate score alone.</w:t>
+      </w:r>
+    </w:p>
     <w:sectPr>
       <w:headerReference w:type="default" r:id="rId8"/>
       <w:footerReference w:type="default" r:id="rId9"/>

</xml_diff>